<commit_message>
Update CV to reflect promotion to Associate Professor (2025)
</commit_message>
<xml_diff>
--- a/cv.docx
+++ b/cv.docx
@@ -35,7 +35,7 @@
           <w:sz w:val="24"/>
           <w:szCs w:val="24"/>
         </w:rPr>
-        <w:t>Assistant Professor</w:t>
+        <w:t>Associate Professor</w:t>
       </w:r>
     </w:p>
     <w:p>
@@ -450,7 +450,7 @@
                 <w:sz w:val="24"/>
                 <w:szCs w:val="24"/>
               </w:rPr>
-              <w:t>2018-present</w:t>
+              <w:t>2018-2025</w:t>
             </w:r>
           </w:p>
         </w:tc>
@@ -473,6 +473,70 @@
                 <w:szCs w:val="24"/>
               </w:rPr>
               <w:t>Assistant Professor</w:t>
+            </w:r>
+          </w:p>
+          <w:p>
+            <w:pPr>
+              <w:rPr>
+                <w:bCs/>
+                <w:sz w:val="24"/>
+                <w:szCs w:val="24"/>
+              </w:rPr>
+            </w:pPr>
+            <w:r>
+              <w:rPr>
+                <w:bCs/>
+                <w:sz w:val="24"/>
+                <w:szCs w:val="24"/>
+              </w:rPr>
+              <w:t>Department of Microbiology and the National Institute of Mathematical and Biological Synthesis (NIMBioS), University of Tennessee</w:t>
+            </w:r>
+          </w:p>
+        </w:tc>
+      </w:tr>
+      <w:tr>
+        <w:trPr>
+          <w:trHeight w:val="935"/>
+        </w:trPr>
+        <w:tc>
+          <w:tcPr>
+            <w:tcW w:w="1555" w:type="dxa"/>
+          </w:tcPr>
+          <w:p>
+            <w:pPr>
+              <w:rPr>
+                <w:sz w:val="24"/>
+                <w:szCs w:val="24"/>
+              </w:rPr>
+            </w:pPr>
+            <w:r>
+              <w:rPr>
+                <w:sz w:val="24"/>
+                <w:szCs w:val="24"/>
+              </w:rPr>
+              <w:t>2025-present</w:t>
+            </w:r>
+          </w:p>
+        </w:tc>
+        <w:tc>
+          <w:tcPr>
+            <w:tcW w:w="7676" w:type="dxa"/>
+          </w:tcPr>
+          <w:p>
+            <w:pPr>
+              <w:rPr>
+                <w:b/>
+                <w:sz w:val="24"/>
+                <w:szCs w:val="24"/>
+              </w:rPr>
+            </w:pPr>
+            <w:r>
+              <w:rPr>
+                <w:b/>
+                <w:sz w:val="24"/>
+                <w:szCs w:val="24"/>
+              </w:rPr>
+              <w:t>Associate Professor</w:t>
             </w:r>
           </w:p>
           <w:p>
@@ -514,7 +578,7 @@
                 <w:sz w:val="24"/>
                 <w:szCs w:val="24"/>
               </w:rPr>
-              <w:t>2020-present</w:t>
+              <w:t>2020-2025</w:t>
             </w:r>
           </w:p>
         </w:tc>
@@ -537,6 +601,70 @@
                 <w:szCs w:val="24"/>
               </w:rPr>
               <w:t>Adjunct Assistant Professor</w:t>
+            </w:r>
+          </w:p>
+          <w:p>
+            <w:pPr>
+              <w:rPr>
+                <w:bCs/>
+                <w:sz w:val="24"/>
+                <w:szCs w:val="24"/>
+              </w:rPr>
+            </w:pPr>
+            <w:r>
+              <w:rPr>
+                <w:bCs/>
+                <w:sz w:val="24"/>
+                <w:szCs w:val="24"/>
+              </w:rPr>
+              <w:t>Department of Ecology and Evolutionary Biology, University of Tennessee</w:t>
+            </w:r>
+          </w:p>
+        </w:tc>
+      </w:tr>
+      <w:tr>
+        <w:trPr>
+          <w:trHeight w:val="656"/>
+        </w:trPr>
+        <w:tc>
+          <w:tcPr>
+            <w:tcW w:w="1555" w:type="dxa"/>
+          </w:tcPr>
+          <w:p>
+            <w:pPr>
+              <w:rPr>
+                <w:sz w:val="24"/>
+                <w:szCs w:val="24"/>
+              </w:rPr>
+            </w:pPr>
+            <w:r>
+              <w:rPr>
+                <w:sz w:val="24"/>
+                <w:szCs w:val="24"/>
+              </w:rPr>
+              <w:t>2025-present</w:t>
+            </w:r>
+          </w:p>
+        </w:tc>
+        <w:tc>
+          <w:tcPr>
+            <w:tcW w:w="7676" w:type="dxa"/>
+          </w:tcPr>
+          <w:p>
+            <w:pPr>
+              <w:rPr>
+                <w:b/>
+                <w:sz w:val="24"/>
+                <w:szCs w:val="24"/>
+              </w:rPr>
+            </w:pPr>
+            <w:r>
+              <w:rPr>
+                <w:b/>
+                <w:sz w:val="24"/>
+                <w:szCs w:val="24"/>
+              </w:rPr>
+              <w:t>Adjunct Associate Professor</w:t>
             </w:r>
           </w:p>
           <w:p>

</xml_diff>

<commit_message>
Reorder Professional Experience to reverse-chronological order
</commit_message>
<xml_diff>
--- a/cv.docx
+++ b/cv.docx
@@ -450,7 +450,7 @@
                 <w:sz w:val="24"/>
                 <w:szCs w:val="24"/>
               </w:rPr>
-              <w:t>2018-2025</w:t>
+              <w:t>2025-present</w:t>
             </w:r>
           </w:p>
         </w:tc>
@@ -472,7 +472,7 @@
                 <w:sz w:val="24"/>
                 <w:szCs w:val="24"/>
               </w:rPr>
-              <w:t>Assistant Professor</w:t>
+              <w:t>Associate Professor</w:t>
             </w:r>
           </w:p>
           <w:p>
@@ -490,6 +490,134 @@
                 <w:szCs w:val="24"/>
               </w:rPr>
               <w:t>Department of Microbiology and the National Institute of Mathematical and Biological Synthesis (NIMBioS), University of Tennessee</w:t>
+            </w:r>
+          </w:p>
+        </w:tc>
+      </w:tr>
+      <w:tr>
+        <w:trPr>
+          <w:trHeight w:val="656"/>
+        </w:trPr>
+        <w:tc>
+          <w:tcPr>
+            <w:tcW w:w="1555" w:type="dxa"/>
+          </w:tcPr>
+          <w:p>
+            <w:pPr>
+              <w:rPr>
+                <w:sz w:val="24"/>
+                <w:szCs w:val="24"/>
+              </w:rPr>
+            </w:pPr>
+            <w:r>
+              <w:rPr>
+                <w:sz w:val="24"/>
+                <w:szCs w:val="24"/>
+              </w:rPr>
+              <w:t>2025-present</w:t>
+            </w:r>
+          </w:p>
+        </w:tc>
+        <w:tc>
+          <w:tcPr>
+            <w:tcW w:w="7676" w:type="dxa"/>
+          </w:tcPr>
+          <w:p>
+            <w:pPr>
+              <w:rPr>
+                <w:b/>
+                <w:sz w:val="24"/>
+                <w:szCs w:val="24"/>
+              </w:rPr>
+            </w:pPr>
+            <w:r>
+              <w:rPr>
+                <w:b/>
+                <w:sz w:val="24"/>
+                <w:szCs w:val="24"/>
+              </w:rPr>
+              <w:t>Adjunct Associate Professor</w:t>
+            </w:r>
+          </w:p>
+          <w:p>
+            <w:pPr>
+              <w:rPr>
+                <w:bCs/>
+                <w:sz w:val="24"/>
+                <w:szCs w:val="24"/>
+              </w:rPr>
+            </w:pPr>
+            <w:r>
+              <w:rPr>
+                <w:bCs/>
+                <w:sz w:val="24"/>
+                <w:szCs w:val="24"/>
+              </w:rPr>
+              <w:t>Department of Ecology and Evolutionary Biology, University of Tennessee</w:t>
+            </w:r>
+          </w:p>
+        </w:tc>
+      </w:tr>
+      <w:tr>
+        <w:trPr>
+          <w:trHeight w:val="656"/>
+        </w:trPr>
+        <w:tc>
+          <w:tcPr>
+            <w:tcW w:w="1555" w:type="dxa"/>
+          </w:tcPr>
+          <w:p>
+            <w:pPr>
+              <w:rPr>
+                <w:sz w:val="24"/>
+                <w:szCs w:val="24"/>
+              </w:rPr>
+            </w:pPr>
+            <w:r>
+              <w:rPr>
+                <w:sz w:val="24"/>
+                <w:szCs w:val="24"/>
+              </w:rPr>
+              <w:t>2020-2025</w:t>
+            </w:r>
+          </w:p>
+        </w:tc>
+        <w:tc>
+          <w:tcPr>
+            <w:tcW w:w="7676" w:type="dxa"/>
+          </w:tcPr>
+          <w:p>
+            <w:pPr>
+              <w:rPr>
+                <w:b/>
+                <w:sz w:val="24"/>
+                <w:szCs w:val="24"/>
+              </w:rPr>
+            </w:pPr>
+            <w:r>
+              <w:rPr>
+                <w:b/>
+                <w:sz w:val="24"/>
+                <w:szCs w:val="24"/>
+              </w:rPr>
+              <w:t>Adjunct Assistant Professor</w:t>
+            </w:r>
+          </w:p>
+          <w:p>
+            <w:pPr>
+              <w:rPr>
+                <w:bCs/>
+                <w:sz w:val="24"/>
+                <w:szCs w:val="24"/>
+              </w:rPr>
+            </w:pPr>
+            <w:r>
+              <w:rPr>
+                <w:bCs/>
+                <w:sz w:val="24"/>
+                <w:szCs w:val="24"/>
+              </w:rPr>
+              <w:t>Department of Ecology and Evolutionary Biology, University of Tennessee</w:t>
             </w:r>
           </w:p>
         </w:tc>
@@ -514,7 +642,7 @@
                 <w:sz w:val="24"/>
                 <w:szCs w:val="24"/>
               </w:rPr>
-              <w:t>2025-present</w:t>
+              <w:t>2018-2025</w:t>
             </w:r>
           </w:p>
         </w:tc>
@@ -536,7 +664,7 @@
                 <w:sz w:val="24"/>
                 <w:szCs w:val="24"/>
               </w:rPr>
-              <w:t>Associate Professor</w:t>
+              <w:t>Assistant Professor</w:t>
             </w:r>
           </w:p>
           <w:p>
@@ -554,134 +682,6 @@
                 <w:szCs w:val="24"/>
               </w:rPr>
               <w:t>Department of Microbiology and the National Institute of Mathematical and Biological Synthesis (NIMBioS), University of Tennessee</w:t>
-            </w:r>
-          </w:p>
-        </w:tc>
-      </w:tr>
-      <w:tr>
-        <w:trPr>
-          <w:trHeight w:val="656"/>
-        </w:trPr>
-        <w:tc>
-          <w:tcPr>
-            <w:tcW w:w="1555" w:type="dxa"/>
-          </w:tcPr>
-          <w:p>
-            <w:pPr>
-              <w:rPr>
-                <w:sz w:val="24"/>
-                <w:szCs w:val="24"/>
-              </w:rPr>
-            </w:pPr>
-            <w:r>
-              <w:rPr>
-                <w:sz w:val="24"/>
-                <w:szCs w:val="24"/>
-              </w:rPr>
-              <w:t>2020-2025</w:t>
-            </w:r>
-          </w:p>
-        </w:tc>
-        <w:tc>
-          <w:tcPr>
-            <w:tcW w:w="7676" w:type="dxa"/>
-          </w:tcPr>
-          <w:p>
-            <w:pPr>
-              <w:rPr>
-                <w:b/>
-                <w:sz w:val="24"/>
-                <w:szCs w:val="24"/>
-              </w:rPr>
-            </w:pPr>
-            <w:r>
-              <w:rPr>
-                <w:b/>
-                <w:sz w:val="24"/>
-                <w:szCs w:val="24"/>
-              </w:rPr>
-              <w:t>Adjunct Assistant Professor</w:t>
-            </w:r>
-          </w:p>
-          <w:p>
-            <w:pPr>
-              <w:rPr>
-                <w:bCs/>
-                <w:sz w:val="24"/>
-                <w:szCs w:val="24"/>
-              </w:rPr>
-            </w:pPr>
-            <w:r>
-              <w:rPr>
-                <w:bCs/>
-                <w:sz w:val="24"/>
-                <w:szCs w:val="24"/>
-              </w:rPr>
-              <w:t>Department of Ecology and Evolutionary Biology, University of Tennessee</w:t>
-            </w:r>
-          </w:p>
-        </w:tc>
-      </w:tr>
-      <w:tr>
-        <w:trPr>
-          <w:trHeight w:val="656"/>
-        </w:trPr>
-        <w:tc>
-          <w:tcPr>
-            <w:tcW w:w="1555" w:type="dxa"/>
-          </w:tcPr>
-          <w:p>
-            <w:pPr>
-              <w:rPr>
-                <w:sz w:val="24"/>
-                <w:szCs w:val="24"/>
-              </w:rPr>
-            </w:pPr>
-            <w:r>
-              <w:rPr>
-                <w:sz w:val="24"/>
-                <w:szCs w:val="24"/>
-              </w:rPr>
-              <w:t>2025-present</w:t>
-            </w:r>
-          </w:p>
-        </w:tc>
-        <w:tc>
-          <w:tcPr>
-            <w:tcW w:w="7676" w:type="dxa"/>
-          </w:tcPr>
-          <w:p>
-            <w:pPr>
-              <w:rPr>
-                <w:b/>
-                <w:sz w:val="24"/>
-                <w:szCs w:val="24"/>
-              </w:rPr>
-            </w:pPr>
-            <w:r>
-              <w:rPr>
-                <w:b/>
-                <w:sz w:val="24"/>
-                <w:szCs w:val="24"/>
-              </w:rPr>
-              <w:t>Adjunct Associate Professor</w:t>
-            </w:r>
-          </w:p>
-          <w:p>
-            <w:pPr>
-              <w:rPr>
-                <w:bCs/>
-                <w:sz w:val="24"/>
-                <w:szCs w:val="24"/>
-              </w:rPr>
-            </w:pPr>
-            <w:r>
-              <w:rPr>
-                <w:bCs/>
-                <w:sz w:val="24"/>
-                <w:szCs w:val="24"/>
-              </w:rPr>
-              <w:t>Department of Ecology and Evolutionary Biology, University of Tennessee</w:t>
             </w:r>
           </w:p>
         </w:tc>

</xml_diff>

<commit_message>
Order Microbiology above EEB appointment at assistant level
</commit_message>
<xml_diff>
--- a/cv.docx
+++ b/cv.docx
@@ -560,7 +560,7 @@
       </w:tr>
       <w:tr>
         <w:trPr>
-          <w:trHeight w:val="656"/>
+          <w:trHeight w:val="935"/>
         </w:trPr>
         <w:tc>
           <w:tcPr>
@@ -578,7 +578,7 @@
                 <w:sz w:val="24"/>
                 <w:szCs w:val="24"/>
               </w:rPr>
-              <w:t>2020-2025</w:t>
+              <w:t>2018-2025</w:t>
             </w:r>
           </w:p>
         </w:tc>
@@ -600,7 +600,7 @@
                 <w:sz w:val="24"/>
                 <w:szCs w:val="24"/>
               </w:rPr>
-              <w:t>Adjunct Assistant Professor</w:t>
+              <w:t>Assistant Professor</w:t>
             </w:r>
           </w:p>
           <w:p>
@@ -617,14 +617,14 @@
                 <w:sz w:val="24"/>
                 <w:szCs w:val="24"/>
               </w:rPr>
-              <w:t>Department of Ecology and Evolutionary Biology, University of Tennessee</w:t>
+              <w:t>Department of Microbiology and the National Institute of Mathematical and Biological Synthesis (NIMBioS), University of Tennessee</w:t>
             </w:r>
           </w:p>
         </w:tc>
       </w:tr>
       <w:tr>
         <w:trPr>
-          <w:trHeight w:val="935"/>
+          <w:trHeight w:val="656"/>
         </w:trPr>
         <w:tc>
           <w:tcPr>
@@ -642,7 +642,7 @@
                 <w:sz w:val="24"/>
                 <w:szCs w:val="24"/>
               </w:rPr>
-              <w:t>2018-2025</w:t>
+              <w:t>2020-2025</w:t>
             </w:r>
           </w:p>
         </w:tc>
@@ -664,7 +664,7 @@
                 <w:sz w:val="24"/>
                 <w:szCs w:val="24"/>
               </w:rPr>
-              <w:t>Assistant Professor</w:t>
+              <w:t>Adjunct Assistant Professor</w:t>
             </w:r>
           </w:p>
           <w:p>
@@ -681,7 +681,7 @@
                 <w:sz w:val="24"/>
                 <w:szCs w:val="24"/>
               </w:rPr>
-              <w:t>Department of Microbiology and the National Institute of Mathematical and Biological Synthesis (NIMBioS), University of Tennessee</w:t>
+              <w:t>Department of Ecology and Evolutionary Biology, University of Tennessee</w:t>
             </w:r>
           </w:p>
         </w:tc>

</xml_diff>

<commit_message>
Add four 2025 poster presentations to CV
</commit_message>
<xml_diff>
--- a/cv.docx
+++ b/cv.docx
@@ -5847,6 +5847,245 @@
           <w:szCs w:val="24"/>
         </w:rPr>
         <w:t>Boldened names indicate people in my research group</w:t>
+      </w:r>
+    </w:p>
+    <w:p>
+      <w:pPr>
+        <w:rPr>
+          <w:sz w:val="24"/>
+          <w:szCs w:val="24"/>
+        </w:rPr>
+      </w:pPr>
+    </w:p>
+    <w:p>
+      <w:pPr>
+        <w:rPr>
+          <w:sz w:val="24"/>
+          <w:szCs w:val="24"/>
+        </w:rPr>
+      </w:pPr>
+      <w:r>
+        <w:rPr>
+          <w:b/>
+          <w:bCs/>
+          <w:sz w:val="24"/>
+          <w:szCs w:val="24"/>
+        </w:rPr>
+        <w:t>Talmy, D., Carr, E.</w:t>
+      </w:r>
+      <w:r>
+        <w:rPr>
+          <w:sz w:val="24"/>
+          <w:szCs w:val="24"/>
+        </w:rPr>
+        <w:t xml:space="preserve"> Modeling community dynamics: impacts of hydrogen peroxide on marine cyanobacteria composition. BioGeoScapes / C-CoMP Modeling Workshop, Woods Hole Oceanographic Institution, Massachusetts, USA, </w:t>
+      </w:r>
+      <w:r>
+        <w:rPr>
+          <w:sz w:val="24"/>
+          <w:szCs w:val="24"/>
+        </w:rPr>
+        <w:t xml:space="preserve">Sept 10</w:t>
+      </w:r>
+      <w:r>
+        <w:rPr>
+          <w:sz w:val="24"/>
+          <w:szCs w:val="24"/>
+          <w:vertAlign w:val="superscript"/>
+        </w:rPr>
+        <w:t>th</w:t>
+      </w:r>
+      <w:r>
+        <w:rPr>
+          <w:sz w:val="24"/>
+          <w:szCs w:val="24"/>
+        </w:rPr>
+        <w:t xml:space="preserve">, 2025.</w:t>
+      </w:r>
+    </w:p>
+    <w:p>
+      <w:pPr>
+        <w:rPr>
+          <w:sz w:val="24"/>
+          <w:szCs w:val="24"/>
+        </w:rPr>
+      </w:pPr>
+    </w:p>
+    <w:p>
+      <w:pPr>
+        <w:rPr>
+          <w:sz w:val="24"/>
+          <w:szCs w:val="24"/>
+        </w:rPr>
+      </w:pPr>
+      <w:r>
+        <w:rPr>
+          <w:b/>
+          <w:bCs/>
+          <w:sz w:val="24"/>
+          <w:szCs w:val="24"/>
+        </w:rPr>
+        <w:t>Talmy, D., Carr, E.</w:t>
+      </w:r>
+      <w:r>
+        <w:rPr>
+          <w:sz w:val="24"/>
+          <w:szCs w:val="24"/>
+        </w:rPr>
+        <w:t xml:space="preserve">, Weitz, J., Dutkiewicz, S. Can viral induced mortality be represented implicitly and capture marine ecological dynamics? BioGeoScapes / C-CoMP Modeling Workshop, Woods Hole Oceanographic Institution, Massachusetts, USA, </w:t>
+      </w:r>
+      <w:r>
+        <w:rPr>
+          <w:sz w:val="24"/>
+          <w:szCs w:val="24"/>
+        </w:rPr>
+        <w:t xml:space="preserve">Sept 10</w:t>
+      </w:r>
+      <w:r>
+        <w:rPr>
+          <w:sz w:val="24"/>
+          <w:szCs w:val="24"/>
+          <w:vertAlign w:val="superscript"/>
+        </w:rPr>
+        <w:t>th</w:t>
+      </w:r>
+      <w:r>
+        <w:rPr>
+          <w:sz w:val="24"/>
+          <w:szCs w:val="24"/>
+        </w:rPr>
+        <w:t xml:space="preserve">, 2025.</w:t>
+      </w:r>
+    </w:p>
+    <w:p>
+      <w:pPr>
+        <w:rPr>
+          <w:sz w:val="24"/>
+          <w:szCs w:val="24"/>
+        </w:rPr>
+      </w:pPr>
+    </w:p>
+    <w:p>
+      <w:pPr>
+        <w:rPr>
+          <w:sz w:val="24"/>
+          <w:szCs w:val="24"/>
+        </w:rPr>
+      </w:pPr>
+      <w:r>
+        <w:rPr>
+          <w:b/>
+          <w:bCs/>
+          <w:sz w:val="24"/>
+          <w:szCs w:val="24"/>
+        </w:rPr>
+        <w:t>Talmy, D., Carr, E.</w:t>
+      </w:r>
+      <w:r>
+        <w:rPr>
+          <w:sz w:val="24"/>
+          <w:szCs w:val="24"/>
+        </w:rPr>
+        <w:t xml:space="preserve">, Dutkiewicz, S., Weitz, J. Can viral induced mortality be represented implicitly and capture marine ecological dynamics? ASLO Aquatic Sciences Meeting, Charlotte, NC, USA, </w:t>
+      </w:r>
+      <w:r>
+        <w:rPr>
+          <w:sz w:val="24"/>
+          <w:szCs w:val="24"/>
+        </w:rPr>
+        <w:t xml:space="preserve">March 27</w:t>
+      </w:r>
+      <w:r>
+        <w:rPr>
+          <w:sz w:val="24"/>
+          <w:szCs w:val="24"/>
+          <w:vertAlign w:val="superscript"/>
+        </w:rPr>
+        <w:t>th</w:t>
+      </w:r>
+      <w:r>
+        <w:rPr>
+          <w:sz w:val="24"/>
+          <w:szCs w:val="24"/>
+        </w:rPr>
+        <w:t xml:space="preserve">, 2025.</w:t>
+      </w:r>
+    </w:p>
+    <w:p>
+      <w:pPr>
+        <w:rPr>
+          <w:sz w:val="24"/>
+          <w:szCs w:val="24"/>
+        </w:rPr>
+      </w:pPr>
+    </w:p>
+    <w:p>
+      <w:pPr>
+        <w:rPr>
+          <w:sz w:val="24"/>
+          <w:szCs w:val="24"/>
+        </w:rPr>
+      </w:pPr>
+      <w:r>
+        <w:rPr>
+          <w:sz w:val="24"/>
+          <w:szCs w:val="24"/>
+        </w:rPr>
+        <w:t xml:space="preserve">Hambrick, K.M., Smith, L.E., Martin, R.M., Stark, G.F., </w:t>
+      </w:r>
+      <w:r>
+        <w:rPr>
+          <w:b/>
+          <w:bCs/>
+          <w:sz w:val="24"/>
+          <w:szCs w:val="24"/>
+        </w:rPr>
+        <w:t>Talmy, D.,</w:t>
+      </w:r>
+      <w:r>
+        <w:rPr>
+          <w:sz w:val="24"/>
+          <w:szCs w:val="24"/>
+        </w:rPr>
+        <w:t xml:space="preserve"> Wilhelm, S.W., Zinser, E.R. Temperature correlates with phage resistance in </w:t>
+      </w:r>
+      <w:r>
+        <w:rPr>
+          <w:i/>
+          <w:iCs/>
+          <w:sz w:val="24"/>
+          <w:szCs w:val="24"/>
+        </w:rPr>
+        <w:t>Microcystis aeruginosa</w:t>
+      </w:r>
+      <w:r>
+        <w:rPr>
+          <w:sz w:val="24"/>
+          <w:szCs w:val="24"/>
+        </w:rPr>
+        <w:t xml:space="preserve"> NIES-298. ASLO Aquatic Sciences Meeting, Charlotte, NC, USA, </w:t>
+      </w:r>
+      <w:r>
+        <w:rPr>
+          <w:sz w:val="24"/>
+          <w:szCs w:val="24"/>
+        </w:rPr>
+        <w:t xml:space="preserve">March 27</w:t>
+      </w:r>
+      <w:r>
+        <w:rPr>
+          <w:sz w:val="24"/>
+          <w:szCs w:val="24"/>
+          <w:vertAlign w:val="superscript"/>
+        </w:rPr>
+        <w:t>th</w:t>
+      </w:r>
+      <w:r>
+        <w:rPr>
+          <w:sz w:val="24"/>
+          <w:szCs w:val="24"/>
+        </w:rPr>
+        <w:t xml:space="preserve">, 2025.</w:t>
       </w:r>
     </w:p>
     <w:p>

</xml_diff>

<commit_message>
Add NOAA and NSF grants to CV
</commit_message>
<xml_diff>
--- a/cv.docx
+++ b/cv.docx
@@ -5878,14 +5878,7 @@
           <w:sz w:val="24"/>
           <w:szCs w:val="24"/>
         </w:rPr>
-        <w:t xml:space="preserve"> Modeling community dynamics: impacts of hydrogen peroxide on marine cyanobacteria composition. BioGeoScapes / C-CoMP Modeling Workshop, Woods Hole Oceanographic Institution, Massachusetts, USA, </w:t>
-      </w:r>
-      <w:r>
-        <w:rPr>
-          <w:sz w:val="24"/>
-          <w:szCs w:val="24"/>
-        </w:rPr>
-        <w:t xml:space="preserve">Sept 10</w:t>
+        <w:t xml:space="preserve"> Modeling community dynamics: impacts of hydrogen peroxide on marine cyanobacteria composition. BioGeoScapes / C-CoMP Modeling Workshop, Woods Hole Oceanographic Institution, Massachusetts, USA, Sept 10</w:t>
       </w:r>
       <w:r>
         <w:rPr>
@@ -5932,14 +5925,7 @@
           <w:sz w:val="24"/>
           <w:szCs w:val="24"/>
         </w:rPr>
-        <w:t xml:space="preserve">, Weitz, J., Dutkiewicz, S. Can viral induced mortality be represented implicitly and capture marine ecological dynamics? BioGeoScapes / C-CoMP Modeling Workshop, Woods Hole Oceanographic Institution, Massachusetts, USA, </w:t>
-      </w:r>
-      <w:r>
-        <w:rPr>
-          <w:sz w:val="24"/>
-          <w:szCs w:val="24"/>
-        </w:rPr>
-        <w:t xml:space="preserve">Sept 10</w:t>
+        <w:t xml:space="preserve">, Weitz, J., Dutkiewicz, S. Can viral induced mortality be represented implicitly and capture marine ecological dynamics? BioGeoScapes / C-CoMP Modeling Workshop, Woods Hole Oceanographic Institution, Massachusetts, USA, Sept 10</w:t>
       </w:r>
       <w:r>
         <w:rPr>
@@ -5986,14 +5972,7 @@
           <w:sz w:val="24"/>
           <w:szCs w:val="24"/>
         </w:rPr>
-        <w:t xml:space="preserve">, Dutkiewicz, S., Weitz, J. Can viral induced mortality be represented implicitly and capture marine ecological dynamics? ASLO Aquatic Sciences Meeting, Charlotte, NC, USA, </w:t>
-      </w:r>
-      <w:r>
-        <w:rPr>
-          <w:sz w:val="24"/>
-          <w:szCs w:val="24"/>
-        </w:rPr>
-        <w:t xml:space="preserve">March 27</w:t>
+        <w:t xml:space="preserve">, Dutkiewicz, S., Weitz, J. Can viral induced mortality be represented implicitly and capture marine ecological dynamics? ASLO Aquatic Sciences Meeting, Charlotte, NC, USA, March 27</w:t>
       </w:r>
       <w:r>
         <w:rPr>
@@ -6063,14 +6042,7 @@
           <w:sz w:val="24"/>
           <w:szCs w:val="24"/>
         </w:rPr>
-        <w:t xml:space="preserve"> NIES-298. ASLO Aquatic Sciences Meeting, Charlotte, NC, USA, </w:t>
-      </w:r>
-      <w:r>
-        <w:rPr>
-          <w:sz w:val="24"/>
-          <w:szCs w:val="24"/>
-        </w:rPr>
-        <w:t xml:space="preserve">March 27</w:t>
+        <w:t xml:space="preserve"> NIES-298. ASLO Aquatic Sciences Meeting, Charlotte, NC, USA, March 27</w:t>
       </w:r>
       <w:r>
         <w:rPr>
@@ -10303,6 +10275,172 @@
         <w:gridCol w:w="4758"/>
         <w:gridCol w:w="2317"/>
       </w:tblGrid>
+      <w:tr>
+        <w:trPr>
+          <w:trHeight w:val="1205"/>
+        </w:trPr>
+        <w:tc>
+          <w:tcPr>
+            <w:tcW w:w="1736" w:type="dxa"/>
+          </w:tcPr>
+          <w:p>
+            <w:pPr>
+              <w:rPr>
+                <w:bCs/>
+                <w:sz w:val="24"/>
+                <w:szCs w:val="24"/>
+              </w:rPr>
+            </w:pPr>
+            <w:r>
+              <w:rPr>
+                <w:bCs/>
+                <w:sz w:val="24"/>
+                <w:szCs w:val="24"/>
+              </w:rPr>
+              <w:t>6/1/2025-5/31/2028</w:t>
+            </w:r>
+          </w:p>
+        </w:tc>
+        <w:tc>
+          <w:tcPr>
+            <w:tcW w:w="7075" w:type="dxa"/>
+            <w:gridSpan w:val="2"/>
+          </w:tcPr>
+          <w:p>
+            <w:pPr>
+              <w:rPr>
+                <w:color w:val="000000"/>
+                <w:sz w:val="24"/>
+                <w:szCs w:val="24"/>
+              </w:rPr>
+            </w:pPr>
+            <w:r>
+              <w:rPr>
+                <w:color w:val="000000"/>
+                <w:sz w:val="24"/>
+                <w:szCs w:val="24"/>
+              </w:rPr>
+              <w:t xml:space="preserve">NOAA Secondary Investigator award (Total award: $746,743 to the Department of Microbiology) </w:t>
+            </w:r>
+            <w:r>
+              <w:rPr>
+                <w:color w:val="000000"/>
+                <w:sz w:val="24"/>
+                <w:szCs w:val="24"/>
+              </w:rPr>
+              <w:t>“</w:t>
+            </w:r>
+            <w:r>
+              <w:rPr>
+                <w:i/>
+                <w:color w:val="000000"/>
+                <w:sz w:val="24"/>
+                <w:szCs w:val="24"/>
+              </w:rPr>
+              <w:t xml:space="preserve">The Effects of Nitrogen Form and Concentration on Toxin Phenotypes of Microcystis</w:t>
+            </w:r>
+            <w:r>
+              <w:rPr>
+                <w:color w:val="000000"/>
+                <w:sz w:val="24"/>
+                <w:szCs w:val="24"/>
+              </w:rPr>
+              <w:t xml:space="preserve">”. ID number: </w:t>
+            </w:r>
+            <w:r>
+              <w:rPr>
+                <w:color w:val="000000"/>
+                <w:sz w:val="24"/>
+                <w:szCs w:val="24"/>
+              </w:rPr>
+              <w:t>NA25NOSX478C0021-T1-01</w:t>
+            </w:r>
+          </w:p>
+        </w:tc>
+      </w:tr>
+      <w:tr>
+        <w:trPr>
+          <w:trHeight w:val="1205"/>
+        </w:trPr>
+        <w:tc>
+          <w:tcPr>
+            <w:tcW w:w="1736" w:type="dxa"/>
+          </w:tcPr>
+          <w:p>
+            <w:pPr>
+              <w:rPr>
+                <w:bCs/>
+                <w:sz w:val="24"/>
+                <w:szCs w:val="24"/>
+              </w:rPr>
+            </w:pPr>
+            <w:r>
+              <w:rPr>
+                <w:bCs/>
+                <w:sz w:val="24"/>
+                <w:szCs w:val="24"/>
+              </w:rPr>
+              <w:t>1/1/2027-12/31/2029</w:t>
+            </w:r>
+          </w:p>
+        </w:tc>
+        <w:tc>
+          <w:tcPr>
+            <w:tcW w:w="7075" w:type="dxa"/>
+            <w:gridSpan w:val="2"/>
+          </w:tcPr>
+          <w:p>
+            <w:pPr>
+              <w:rPr>
+                <w:color w:val="000000"/>
+                <w:sz w:val="24"/>
+                <w:szCs w:val="24"/>
+              </w:rPr>
+            </w:pPr>
+            <w:r>
+              <w:rPr>
+                <w:color w:val="000000"/>
+                <w:sz w:val="24"/>
+                <w:szCs w:val="24"/>
+              </w:rPr>
+              <w:t xml:space="preserve">NSF Secondary Investigator award (Total award: $1,454,878 to the Department of Microbiology) </w:t>
+            </w:r>
+            <w:r>
+              <w:rPr>
+                <w:color w:val="000000"/>
+                <w:sz w:val="24"/>
+                <w:szCs w:val="24"/>
+              </w:rPr>
+              <w:t>“</w:t>
+            </w:r>
+            <w:r>
+              <w:rPr>
+                <w:i/>
+                <w:color w:val="000000"/>
+                <w:sz w:val="24"/>
+                <w:szCs w:val="24"/>
+              </w:rPr>
+              <w:t xml:space="preserve">How temporal niche partitioning and growth on urea selects for cyanobacteria in fresh waters</w:t>
+            </w:r>
+            <w:r>
+              <w:rPr>
+                <w:color w:val="000000"/>
+                <w:sz w:val="24"/>
+                <w:szCs w:val="24"/>
+              </w:rPr>
+              <w:t xml:space="preserve">”. ID number: </w:t>
+            </w:r>
+            <w:r>
+              <w:rPr>
+                <w:color w:val="000000"/>
+                <w:sz w:val="24"/>
+                <w:szCs w:val="24"/>
+              </w:rPr>
+              <w:t>DEB-2534721</w:t>
+            </w:r>
+          </w:p>
+        </w:tc>
+      </w:tr>
       <w:tr>
         <w:trPr>
           <w:trHeight w:val="1205"/>

</xml_diff>

<commit_message>
Fix investigator role wording on grant entries
</commit_message>
<xml_diff>
--- a/cv.docx
+++ b/cv.docx
@@ -10320,15 +10320,7 @@
                 <w:sz w:val="24"/>
                 <w:szCs w:val="24"/>
               </w:rPr>
-              <w:t xml:space="preserve">NOAA Secondary Investigator award (Total award: $746,743 to the Department of Microbiology) </w:t>
-            </w:r>
-            <w:r>
-              <w:rPr>
-                <w:color w:val="000000"/>
-                <w:sz w:val="24"/>
-                <w:szCs w:val="24"/>
-              </w:rPr>
-              <w:t>“</w:t>
+              <w:t xml:space="preserve">NOAA co-Principal Investigator award (Total award: $746,743 to the Department of Microbiology) “</w:t>
             </w:r>
             <w:r>
               <w:rPr>
@@ -10345,15 +10337,7 @@
                 <w:sz w:val="24"/>
                 <w:szCs w:val="24"/>
               </w:rPr>
-              <w:t xml:space="preserve">”. ID number: </w:t>
-            </w:r>
-            <w:r>
-              <w:rPr>
-                <w:color w:val="000000"/>
-                <w:sz w:val="24"/>
-                <w:szCs w:val="24"/>
-              </w:rPr>
-              <w:t>NA25NOSX478C0021-T1-01</w:t>
+              <w:t xml:space="preserve">”. ID number: NA25NOSX478C0021-T1-01</w:t>
             </w:r>
           </w:p>
         </w:tc>
@@ -10403,15 +10387,7 @@
                 <w:sz w:val="24"/>
                 <w:szCs w:val="24"/>
               </w:rPr>
-              <w:t xml:space="preserve">NSF Secondary Investigator award (Total award: $1,454,878 to the Department of Microbiology) </w:t>
-            </w:r>
-            <w:r>
-              <w:rPr>
-                <w:color w:val="000000"/>
-                <w:sz w:val="24"/>
-                <w:szCs w:val="24"/>
-              </w:rPr>
-              <w:t>“</w:t>
+              <w:t xml:space="preserve">NSF co-Principal Investigator award (Total award: $1,454,878 to the Department of Microbiology) “</w:t>
             </w:r>
             <w:r>
               <w:rPr>
@@ -10428,15 +10404,7 @@
                 <w:sz w:val="24"/>
                 <w:szCs w:val="24"/>
               </w:rPr>
-              <w:t xml:space="preserve">”. ID number: </w:t>
-            </w:r>
-            <w:r>
-              <w:rPr>
-                <w:color w:val="000000"/>
-                <w:sz w:val="24"/>
-                <w:szCs w:val="24"/>
-              </w:rPr>
-              <w:t>DEB-2534721</w:t>
+              <w:t xml:space="preserve">”. ID number: DEB-2534721</w:t>
             </w:r>
           </w:p>
         </w:tc>

</xml_diff>